<commit_message>
Docs to v2.1 state; reprice to $49 Pro / $79 Team
- README: pipeline diagram (+primary sources, shared memory), project structure,
  roadmap through v2.1, next = SOC 2/SSO/MS calendar/mobile
- pipeline-spec: phasing marked shipped through v2.1, pricing updated
- Pitch deck: $49 pricing, unit-econ chart 49/12/37 (~75% margin), roadmap
  slide shows v2 TEAMS+SOURCES shipped, under-the-hood refreshed
- Business plan: $49/$79 tiers (Team shipped), ARPU/ARR/margin projections
  recomputed, market sizing $590M, status v2.1, funding milestones updated
</commit_message>
<xml_diff>
--- a/docs/salesrx-business-plan.docx
+++ b/docs/salesrx-business-plan.docx
@@ -145,7 +145,7 @@
           <w:sz w:val="21"/>
           <w:szCs w:val="21"/>
         </w:rPr>
-        <w:t xml:space="preserve">the product is built and deployable today (v1.2): live AI research with citations, verified job-posting technographics, watchlist alerts, calendar auto-briefing, HubSpot sync, and Docker self-hosting. We are pre-revenue, seeking design partners and a pre-seed round of $1.0–1.5M to reach 100+ paying reps and the metrics for a strong seed.</w:t>
+        <w:t xml:space="preserve">the product is built and deployable today (v2.1): live AI research with citations, verified job-posting technographics, SEC filings + press + earnings-call primary sources, watchlist alerts, calendar auto-briefing (Google OAuth or ICS), multi-rep team workspaces with shared account memory on Postgres, HubSpot and Salesforce sync, and Docker self-hosting. We are pre-revenue, seeking design partners and a pre-seed round of $1.0–1.5M to reach 100+ paying reps and the metrics for a strong seed.</w:t>
       </w:r>
     </w:p>
     <w:p>
@@ -486,7 +486,7 @@
           <w:sz w:val="21"/>
           <w:szCs w:val="21"/>
         </w:rPr>
-        <w:t xml:space="preserve">1M addressable reps × $470/yr blended ≈ $470M serviceable market; capturing 0.5–2% over five years supports a venture-scale outcome.</w:t>
+        <w:t xml:space="preserve">1M addressable reps × $590/yr blended ≈ $590M serviceable market; capturing 0.5–2% over five years supports a venture-scale outcome.</w:t>
       </w:r>
     </w:p>
     <w:p>
@@ -985,7 +985,7 @@
           <w:sz w:val="21"/>
           <w:szCs w:val="21"/>
         </w:rPr>
-        <w:t xml:space="preserve">free tier (5 briefs/mo) lands individual reps; value is felt on the first brief. Pro at $39/rep/mo; Team tier at $79/rep/mo (shared memory, admin, SSO) follows the rep into the org.</w:t>
+        <w:t xml:space="preserve">free tier (5 briefs/mo) lands individual reps; value is felt on the first brief. Pro at $49/rep/mo; Team tier at $79/rep/mo (shared workspace memory — shipped in v2.0) follows the rep into the org.</w:t>
       </w:r>
     </w:p>
     <w:p>
@@ -1288,7 +1288,7 @@
                 <w:sz w:val="19"/>
                 <w:szCs w:val="19"/>
               </w:rPr>
-              <w:t xml:space="preserve">$39/rep/mo</w:t>
+              <w:t xml:space="preserve">$49/rep/mo</w:t>
             </w:r>
           </w:p>
         </w:tc>
@@ -1339,7 +1339,7 @@
                 <w:sz w:val="19"/>
                 <w:szCs w:val="19"/>
               </w:rPr>
-              <w:t xml:space="preserve">Team (planned)</w:t>
+              <w:t xml:space="preserve">Team</w:t>
             </w:r>
           </w:p>
         </w:tc>
@@ -1387,7 +1387,7 @@
                 <w:sz w:val="19"/>
                 <w:szCs w:val="19"/>
               </w:rPr>
-              <w:t xml:space="preserve">Shared account memory, admin, SSO, Salesforce</w:t>
+              <w:t xml:space="preserve">Workspaces with shared account memory (shipped v2.0), admin, Salesforce; SSO planned</w:t>
             </w:r>
           </w:p>
         </w:tc>
@@ -1420,7 +1420,7 @@
           <w:sz w:val="21"/>
           <w:szCs w:val="21"/>
         </w:rPr>
-        <w:t xml:space="preserve">COGS ≈ $12/rep/mo at ~30 briefs (AI + data), ≈ 70% gross margin at Pro pricing, improving with caching and model-cost declines.</w:t>
+        <w:t xml:space="preserve">COGS ≈ $12/rep/mo at ~30 briefs (AI + data), ≈ 75% gross margin at $49 Pro pricing, improving with caching and model-cost declines.</w:t>
       </w:r>
     </w:p>
     <w:p>
@@ -1705,7 +1705,7 @@
                 <w:sz w:val="19"/>
                 <w:szCs w:val="19"/>
               </w:rPr>
-              <w:t xml:space="preserve">$39</w:t>
+              <w:t xml:space="preserve">$49</w:t>
             </w:r>
           </w:p>
         </w:tc>
@@ -1730,7 +1730,7 @@
                 <w:sz w:val="19"/>
                 <w:szCs w:val="19"/>
               </w:rPr>
-              <w:t xml:space="preserve">$47</w:t>
+              <w:t xml:space="preserve">$56</w:t>
             </w:r>
           </w:p>
         </w:tc>
@@ -1755,7 +1755,7 @@
                 <w:sz w:val="19"/>
                 <w:szCs w:val="19"/>
               </w:rPr>
-              <w:t xml:space="preserve">$52</w:t>
+              <w:t xml:space="preserve">$62</w:t>
             </w:r>
           </w:p>
         </w:tc>
@@ -1805,7 +1805,7 @@
                 <w:sz w:val="19"/>
                 <w:szCs w:val="19"/>
               </w:rPr>
-              <w:t xml:space="preserve">≈ $280K</w:t>
+              <w:t xml:space="preserve">≈ $350K</w:t>
             </w:r>
           </w:p>
         </w:tc>
@@ -1829,7 +1829,7 @@
                 <w:sz w:val="19"/>
                 <w:szCs w:val="19"/>
               </w:rPr>
-              <w:t xml:space="preserve">≈ $1.7M</w:t>
+              <w:t xml:space="preserve">≈ $2.0M</w:t>
             </w:r>
           </w:p>
         </w:tc>
@@ -1853,7 +1853,7 @@
                 <w:sz w:val="19"/>
                 <w:szCs w:val="19"/>
               </w:rPr>
-              <w:t xml:space="preserve">≈ $6.2M</w:t>
+              <w:t xml:space="preserve">≈ $7.4M</w:t>
             </w:r>
           </w:p>
         </w:tc>
@@ -1905,7 +1905,7 @@
                 <w:sz w:val="19"/>
                 <w:szCs w:val="19"/>
               </w:rPr>
-              <w:t xml:space="preserve">~70%</w:t>
+              <w:t xml:space="preserve">~75%</w:t>
             </w:r>
           </w:p>
         </w:tc>
@@ -1930,7 +1930,7 @@
                 <w:sz w:val="19"/>
                 <w:szCs w:val="19"/>
               </w:rPr>
-              <w:t xml:space="preserve">~74%</w:t>
+              <w:t xml:space="preserve">~77%</w:t>
             </w:r>
           </w:p>
         </w:tc>
@@ -1955,7 +1955,7 @@
                 <w:sz w:val="19"/>
                 <w:szCs w:val="19"/>
               </w:rPr>
-              <w:t xml:space="preserve">~78%</w:t>
+              <w:t xml:space="preserve">~80%</w:t>
             </w:r>
           </w:p>
         </w:tc>
@@ -2237,7 +2237,7 @@
                 <w:sz w:val="19"/>
                 <w:szCs w:val="19"/>
               </w:rPr>
-              <w:t xml:space="preserve">18-mo runway · 2 eng + 1 GTM hire · 20 design partners → 100+ paying reps · conversion-lift case study · SOC 2 started</w:t>
+              <w:t xml:space="preserve">18-mo runway · 2 eng + 1 GTM hire · 20 design partners → 100+ paying reps · conversion-lift case study · SOC 2 started (product already at v2.1)</w:t>
             </w:r>
           </w:p>
         </w:tc>
@@ -2339,7 +2339,7 @@
                 <w:sz w:val="19"/>
                 <w:szCs w:val="19"/>
               </w:rPr>
-              <w:t xml:space="preserve">$500K+ ARR · Team tier + Salesforce shipped · repeatable PLG→team motion · 3 lighthouse team logos</w:t>
+              <w:t xml:space="preserve">$500K+ ARR · repeatable PLG→team motion · 3 lighthouse team logos · enterprise SSO + SOC 2 complete</w:t>
             </w:r>
           </w:p>
         </w:tc>
@@ -2481,7 +2481,7 @@
           <w:sz w:val="21"/>
           <w:szCs w:val="21"/>
         </w:rPr>
-        <w:t xml:space="preserve">55% engineering (2 founding engineers): v2 multi-rep teams, Postgres, OAuth calendars, Salesforce, SOC 2.</w:t>
+        <w:t xml:space="preserve">55% engineering (2 founding engineers): reliability &amp; scale, SOC 2, enterprise SSO, Microsoft calendar, mobile.</w:t>
       </w:r>
     </w:p>
     <w:p>

</xml_diff>